<commit_message>
docs: resolve learning system boundaries
</commit_message>
<xml_diff>
--- a/docs/architecture/Cramapple-System-Context-and-Logical-Component-Architecture-v0.1.docx
+++ b/docs/architecture/Cramapple-System-Context-and-Logical-Component-Architecture-v0.1.docx
@@ -75,7 +75,7 @@
           <w:color w:val="202D3A"/>
           <w:sz w:val="21"/>
         </w:rPr>
-        <w:t>June 10, 2026</w:t>
+        <w:t>June 11, 2026</w:t>
       </w:r>
     </w:p>
     <w:p>
@@ -3313,23 +3313,7 @@
         <w:spacing w:after="160" w:line="280" w:lineRule="auto"/>
       </w:pPr>
       <w:r>
-        <w:t>Before public publication, sweeps for the signed-in user's proper name variants and holds or removes matches.</w:t>
-      </w:r>
-    </w:p>
-    <w:p>
-      <w:pPr>
-        <w:pStyle w:val="Heading2"/>
-      </w:pPr>
-      <w:r>
-        <w:t>8.4 Assessment Domain</w:t>
-      </w:r>
-    </w:p>
-    <w:p>
-      <w:pPr>
-        <w:pStyle w:val="Heading3"/>
-      </w:pPr>
-      <w:r>
-        <w:t>Submission Service</w:t>
+        <w:t>Hands approved public-page candidates to the marketing/content publication workflow; publication does not change private learner evidence, grading, or access.</w:t>
       </w:r>
     </w:p>
     <w:p>
@@ -3341,7 +3325,23 @@
         <w:spacing w:after="160" w:line="280" w:lineRule="auto"/>
       </w:pPr>
       <w:r>
-        <w:t>Owns immutable student submissions and revisions.</w:t>
+        <w:t>Before public publication, sweeps for the signed-in user's proper name variants and holds or removes matches.</w:t>
+      </w:r>
+    </w:p>
+    <w:p>
+      <w:pPr>
+        <w:pStyle w:val="Heading2"/>
+      </w:pPr>
+      <w:r>
+        <w:t>8.4 Assessment Domain</w:t>
+      </w:r>
+    </w:p>
+    <w:p>
+      <w:pPr>
+        <w:pStyle w:val="Heading3"/>
+      </w:pPr>
+      <w:r>
+        <w:t>Submission Service</w:t>
       </w:r>
     </w:p>
     <w:p>
@@ -3353,7 +3353,7 @@
         <w:spacing w:after="160" w:line="280" w:lineRule="auto"/>
       </w:pPr>
       <w:r>
-        <w:t>Stores response modality, question version, timing, assistance, and submission context.</w:t>
+        <w:t>Owns immutable student submissions and revisions.</w:t>
       </w:r>
     </w:p>
     <w:p>
@@ -3365,15 +3365,7 @@
         <w:spacing w:after="160" w:line="280" w:lineRule="auto"/>
       </w:pPr>
       <w:r>
-        <w:t>Distinguishes abandoned drafts from completed attempts.</w:t>
-      </w:r>
-    </w:p>
-    <w:p>
-      <w:pPr>
-        <w:pStyle w:val="Heading3"/>
-      </w:pPr>
-      <w:r>
-        <w:t>Grading Orchestrator</w:t>
+        <w:t>Stores response modality, question version, timing, assistance, and submission context.</w:t>
       </w:r>
     </w:p>
     <w:p>
@@ -3385,7 +3377,15 @@
         <w:spacing w:after="160" w:line="280" w:lineRule="auto"/>
       </w:pPr>
       <w:r>
-        <w:t>Selects the applicable grading package and evaluation workflow.</w:t>
+        <w:t>Distinguishes abandoned drafts from completed attempts.</w:t>
+      </w:r>
+    </w:p>
+    <w:p>
+      <w:pPr>
+        <w:pStyle w:val="Heading3"/>
+      </w:pPr>
+      <w:r>
+        <w:t>Grading Orchestrator</w:t>
       </w:r>
     </w:p>
     <w:p>
@@ -3397,7 +3397,7 @@
         <w:spacing w:after="160" w:line="280" w:lineRule="auto"/>
       </w:pPr>
       <w:r>
-        <w:t>Combines deterministic checks, model-supported evaluation, and human review.</w:t>
+        <w:t>Selects the applicable grading package and evaluation workflow.</w:t>
       </w:r>
     </w:p>
     <w:p>
@@ -3409,15 +3409,7 @@
         <w:spacing w:after="160" w:line="280" w:lineRule="auto"/>
       </w:pPr>
       <w:r>
-        <w:t>Returns criterion-level evidence, estimated scoring, feedback, and confidence.</w:t>
-      </w:r>
-    </w:p>
-    <w:p>
-      <w:pPr>
-        <w:pStyle w:val="Heading3"/>
-      </w:pPr>
-      <w:r>
-        <w:t>Criterion Evaluation Adapters</w:t>
+        <w:t>Combines deterministic checks, model-supported evaluation, and human review.</w:t>
       </w:r>
     </w:p>
     <w:p>
@@ -3429,7 +3421,15 @@
         <w:spacing w:after="160" w:line="280" w:lineRule="auto"/>
       </w:pPr>
       <w:r>
-        <w:t>Hide provider-specific model calls behind typed task contracts.</w:t>
+        <w:t>Returns criterion-level evidence, estimated scoring, feedback, and confidence.</w:t>
+      </w:r>
+    </w:p>
+    <w:p>
+      <w:pPr>
+        <w:pStyle w:val="Heading3"/>
+      </w:pPr>
+      <w:r>
+        <w:t>Criterion Evaluation Adapters</w:t>
       </w:r>
     </w:p>
     <w:p>
@@ -3441,7 +3441,7 @@
         <w:spacing w:after="160" w:line="280" w:lineRule="auto"/>
       </w:pPr>
       <w:r>
-        <w:t>Validate structured outputs and retry only within policy.</w:t>
+        <w:t>Hide provider-specific model calls behind typed task contracts.</w:t>
       </w:r>
     </w:p>
     <w:p>
@@ -3453,15 +3453,7 @@
         <w:spacing w:after="160" w:line="280" w:lineRule="auto"/>
       </w:pPr>
       <w:r>
-        <w:t>Preserve prompt, model, parameter, and source versions for audit.</w:t>
-      </w:r>
-    </w:p>
-    <w:p>
-      <w:pPr>
-        <w:pStyle w:val="Heading3"/>
-      </w:pPr>
-      <w:r>
-        <w:t>Confidence and Human-Escalation Service</w:t>
+        <w:t>Validate structured outputs and retry only within policy.</w:t>
       </w:r>
     </w:p>
     <w:p>
@@ -3473,7 +3465,15 @@
         <w:spacing w:after="160" w:line="280" w:lineRule="auto"/>
       </w:pPr>
       <w:r>
-        <w:t>Converts evaluation signals into calibrated confidence bands.</w:t>
+        <w:t>Preserve prompt, model, parameter, and source versions for audit.</w:t>
+      </w:r>
+    </w:p>
+    <w:p>
+      <w:pPr>
+        <w:pStyle w:val="Heading3"/>
+      </w:pPr>
+      <w:r>
+        <w:t>Confidence and Human-Escalation Service</w:t>
       </w:r>
     </w:p>
     <w:p>
@@ -3485,7 +3485,7 @@
         <w:spacing w:after="160" w:line="280" w:lineRule="auto"/>
       </w:pPr>
       <w:r>
-        <w:t>Routes ambiguous, novel, high-impact, or disagreement cases to validators.</w:t>
+        <w:t>Converts evaluation signals into calibrated confidence bands.</w:t>
       </w:r>
     </w:p>
     <w:p>
@@ -3497,31 +3497,7 @@
         <w:spacing w:after="160" w:line="280" w:lineRule="auto"/>
       </w:pPr>
       <w:r>
-        <w:t>Prevents low-confidence scoring from being presented as authoritative.</w:t>
-      </w:r>
-    </w:p>
-    <w:p>
-      <w:pPr>
-        <w:pStyle w:val="Heading2"/>
-      </w:pPr>
-      <w:r>
-        <w:t>8.5 Exam and Knowledge Domain</w:t>
-      </w:r>
-    </w:p>
-    <w:p>
-      <w:pPr>
-        <w:pStyle w:val="Heading3"/>
-      </w:pPr>
-      <w:r>
-        <w:t>Exam Specification Registry</w:t>
-      </w:r>
-    </w:p>
-    <w:p>
-      <w:pPr>
-        <w:widowControl/>
-      </w:pPr>
-      <w:r>
-        <w:t>The registry is the authoritative store for exam facts that guide prioritization. Each fact must include:</w:t>
+        <w:t>Routes ambiguous, novel, high-impact, or disagreement cases to validators.</w:t>
       </w:r>
     </w:p>
     <w:p>
@@ -3533,7 +3509,31 @@
         <w:spacing w:after="160" w:line="280" w:lineRule="auto"/>
       </w:pPr>
       <w:r>
-        <w:t>Exam and school-year version.</w:t>
+        <w:t>Prevents low-confidence scoring from being presented as authoritative.</w:t>
+      </w:r>
+    </w:p>
+    <w:p>
+      <w:pPr>
+        <w:pStyle w:val="Heading2"/>
+      </w:pPr>
+      <w:r>
+        <w:t>8.5 Exam and Knowledge Domain</w:t>
+      </w:r>
+    </w:p>
+    <w:p>
+      <w:pPr>
+        <w:pStyle w:val="Heading3"/>
+      </w:pPr>
+      <w:r>
+        <w:t>Exam Specification Registry</w:t>
+      </w:r>
+    </w:p>
+    <w:p>
+      <w:pPr>
+        <w:widowControl/>
+      </w:pPr>
+      <w:r>
+        <w:t>The registry is the authoritative store for exam facts that guide prioritization. Each fact must include:</w:t>
       </w:r>
     </w:p>
     <w:p>
@@ -3545,7 +3545,7 @@
         <w:spacing w:after="160" w:line="280" w:lineRule="auto"/>
       </w:pPr>
       <w:r>
-        <w:t>Effective and expiration dates.</w:t>
+        <w:t>Exam and school-year version.</w:t>
       </w:r>
     </w:p>
     <w:p>
@@ -3557,7 +3557,7 @@
         <w:spacing w:after="160" w:line="280" w:lineRule="auto"/>
       </w:pPr>
       <w:r>
-        <w:t>Official source and source type.</w:t>
+        <w:t>Effective and expiration dates.</w:t>
       </w:r>
     </w:p>
     <w:p>
@@ -3569,7 +3569,7 @@
         <w:spacing w:after="160" w:line="280" w:lineRule="auto"/>
       </w:pPr>
       <w:r>
-        <w:t>Source publication or update date when available.</w:t>
+        <w:t>Official source and source type.</w:t>
       </w:r>
     </w:p>
     <w:p>
@@ -3581,7 +3581,7 @@
         <w:spacing w:after="160" w:line="280" w:lineRule="auto"/>
       </w:pPr>
       <w:r>
-        <w:t>Retrieval date.</w:t>
+        <w:t>Source publication or update date when available.</w:t>
       </w:r>
     </w:p>
     <w:p>
@@ -3593,7 +3593,7 @@
         <w:spacing w:after="160" w:line="280" w:lineRule="auto"/>
       </w:pPr>
       <w:r>
-        <w:t>Exact scope, such as "multiple-choice section" rather than "whole exam."</w:t>
+        <w:t>Retrieval date.</w:t>
       </w:r>
     </w:p>
     <w:p>
@@ -3605,7 +3605,7 @@
         <w:spacing w:after="160" w:line="280" w:lineRule="auto"/>
       </w:pPr>
       <w:r>
-        <w:t>Value, range, unit, and any conditions.</w:t>
+        <w:t>Exact scope, such as "multiple-choice section" rather than "whole exam."</w:t>
       </w:r>
     </w:p>
     <w:p>
@@ -3617,7 +3617,7 @@
         <w:spacing w:after="160" w:line="280" w:lineRule="auto"/>
       </w:pPr>
       <w:r>
-        <w:t>Validator and approval state.</w:t>
+        <w:t>Value, range, unit, and any conditions.</w:t>
       </w:r>
     </w:p>
     <w:p>
@@ -3629,31 +3629,7 @@
         <w:spacing w:after="160" w:line="280" w:lineRule="auto"/>
       </w:pPr>
       <w:r>
-        <w:t>Supersession relationship.</w:t>
-      </w:r>
-    </w:p>
-    <w:p>
-      <w:pPr>
-        <w:widowControl/>
-      </w:pPr>
-      <w:r>
-        <w:t>Examples include section weights, question counts, timing, raw-point distributions, unit ranges, science-practice ranges, FRQ archetypes, part-level points, task definitions, calculator rules, and exam-delivery mode.</w:t>
-      </w:r>
-    </w:p>
-    <w:p>
-      <w:pPr>
-        <w:widowControl/>
-      </w:pPr>
-      <w:r>
-        <w:t>Official facts and Cramapple-derived planning values are separate record types. A derived value must identify its formula, inputs, assumptions, model version, and approval.</w:t>
-      </w:r>
-    </w:p>
-    <w:p>
-      <w:pPr>
-        <w:pStyle w:val="Heading3"/>
-      </w:pPr>
-      <w:r>
-        <w:t>Canonical Content Repository</w:t>
+        <w:t>Validator and approval state.</w:t>
       </w:r>
     </w:p>
     <w:p>
@@ -3665,7 +3641,31 @@
         <w:spacing w:after="160" w:line="280" w:lineRule="auto"/>
       </w:pPr>
       <w:r>
-        <w:t>Owns approved questions, stimuli, lessons, hints, examples, misconception interventions, and transfer variants.</w:t>
+        <w:t>Supersession relationship.</w:t>
+      </w:r>
+    </w:p>
+    <w:p>
+      <w:pPr>
+        <w:widowControl/>
+      </w:pPr>
+      <w:r>
+        <w:t>Examples include section weights, question counts, timing, raw-point distributions, unit ranges, science-practice ranges, FRQ archetypes, part-level points, task definitions, calculator rules, and exam-delivery mode.</w:t>
+      </w:r>
+    </w:p>
+    <w:p>
+      <w:pPr>
+        <w:widowControl/>
+      </w:pPr>
+      <w:r>
+        <w:t>Official facts and Cramapple-derived planning values are separate record types. A derived value must identify its formula, inputs, assumptions, model version, and approval.</w:t>
+      </w:r>
+    </w:p>
+    <w:p>
+      <w:pPr>
+        <w:pStyle w:val="Heading3"/>
+      </w:pPr>
+      <w:r>
+        <w:t>Canonical Content Repository</w:t>
       </w:r>
     </w:p>
     <w:p>
@@ -3677,7 +3677,7 @@
         <w:spacing w:after="160" w:line="280" w:lineRule="auto"/>
       </w:pPr>
       <w:r>
-        <w:t>Tags artifacts to exam, unit, topic, learning objective, practice, skill, task verb, question type, and difficulty.</w:t>
+        <w:t>Owns approved questions, stimuli, lessons, hints, examples, misconception interventions, and transfer variants.</w:t>
       </w:r>
     </w:p>
     <w:p>
@@ -3689,15 +3689,7 @@
         <w:spacing w:after="160" w:line="280" w:lineRule="auto"/>
       </w:pPr>
       <w:r>
-        <w:t>Keeps public, licensed, authored, and restricted materials distinguishable.</w:t>
-      </w:r>
-    </w:p>
-    <w:p>
-      <w:pPr>
-        <w:pStyle w:val="Heading3"/>
-      </w:pPr>
-      <w:r>
-        <w:t>Rubric and Scoring Package Repository</w:t>
+        <w:t>Tags artifacts to exam, unit, topic, learning objective, practice, skill, task verb, question type, and difficulty.</w:t>
       </w:r>
     </w:p>
     <w:p>
@@ -3709,7 +3701,15 @@
         <w:spacing w:after="160" w:line="280" w:lineRule="auto"/>
       </w:pPr>
       <w:r>
-        <w:t>Owns question-specific and archetype-level grading criteria.</w:t>
+        <w:t>Keeps public, licensed, authored, and restricted materials distinguishable.</w:t>
+      </w:r>
+    </w:p>
+    <w:p>
+      <w:pPr>
+        <w:pStyle w:val="Heading3"/>
+      </w:pPr>
+      <w:r>
+        <w:t>Rubric and Scoring Package Repository</w:t>
       </w:r>
     </w:p>
     <w:p>
@@ -3721,7 +3721,7 @@
         <w:spacing w:after="160" w:line="280" w:lineRule="auto"/>
       </w:pPr>
       <w:r>
-        <w:t>Stores official scoring guidance, accepted alternatives, common non-credit responses, samples, and calibration cases.</w:t>
+        <w:t>Owns question-specific and archetype-level grading criteria.</w:t>
       </w:r>
     </w:p>
     <w:p>
@@ -3733,15 +3733,7 @@
         <w:spacing w:after="160" w:line="280" w:lineRule="auto"/>
       </w:pPr>
       <w:r>
-        <w:t>Is consumed by grading but may also expose approved criterion descriptions to teaching.</w:t>
-      </w:r>
-    </w:p>
-    <w:p>
-      <w:pPr>
-        <w:pStyle w:val="Heading3"/>
-      </w:pPr>
-      <w:r>
-        <w:t>Source and Provenance Registry</w:t>
+        <w:t>Stores official scoring guidance, accepted alternatives, common non-credit responses, samples, and calibration cases.</w:t>
       </w:r>
     </w:p>
     <w:p>
@@ -3753,7 +3745,15 @@
         <w:spacing w:after="160" w:line="280" w:lineRule="auto"/>
       </w:pPr>
       <w:r>
-        <w:t>Records where every exam fact and content artifact came from.</w:t>
+        <w:t>Is consumed by grading but may also expose approved criterion descriptions to teaching.</w:t>
+      </w:r>
+    </w:p>
+    <w:p>
+      <w:pPr>
+        <w:pStyle w:val="Heading3"/>
+      </w:pPr>
+      <w:r>
+        <w:t>Source and Provenance Registry</w:t>
       </w:r>
     </w:p>
     <w:p>
@@ -3765,7 +3765,7 @@
         <w:spacing w:after="160" w:line="280" w:lineRule="auto"/>
       </w:pPr>
       <w:r>
-        <w:t>Tracks legal/use status, access restrictions, checksum, publication year, and review history.</w:t>
+        <w:t>Records where every exam fact and content artifact came from.</w:t>
       </w:r>
     </w:p>
     <w:p>
@@ -3777,15 +3777,7 @@
         <w:spacing w:after="160" w:line="280" w:lineRule="auto"/>
       </w:pPr>
       <w:r>
-        <w:t>Supports source replacement and impact analysis.</w:t>
-      </w:r>
-    </w:p>
-    <w:p>
-      <w:pPr>
-        <w:pStyle w:val="Heading3"/>
-      </w:pPr>
-      <w:r>
-        <w:t>Exam Pack Resolver</w:t>
+        <w:t>Tracks legal/use status, access restrictions, checksum, publication year, and review history.</w:t>
       </w:r>
     </w:p>
     <w:p>
@@ -3797,7 +3789,15 @@
         <w:spacing w:after="160" w:line="280" w:lineRule="auto"/>
       </w:pPr>
       <w:r>
-        <w:t>Assembles the active, approved versions of exam specification, taxonomy, content, teaching policy extensions, rubrics, and validator qualifications.</w:t>
+        <w:t>Supports source replacement and impact analysis.</w:t>
+      </w:r>
+    </w:p>
+    <w:p>
+      <w:pPr>
+        <w:pStyle w:val="Heading3"/>
+      </w:pPr>
+      <w:r>
+        <w:t>Exam Pack Resolver</w:t>
       </w:r>
     </w:p>
     <w:p>
@@ -3809,7 +3809,7 @@
         <w:spacing w:after="160" w:line="280" w:lineRule="auto"/>
       </w:pPr>
       <w:r>
-        <w:t>Prevents partially approved versions from becoming active.</w:t>
+        <w:t>Assembles the active, approved versions of exam specification, taxonomy, content, teaching policy extensions, rubrics, and validator qualifications.</w:t>
       </w:r>
     </w:p>
     <w:p>
@@ -3821,23 +3821,7 @@
         <w:spacing w:after="160" w:line="280" w:lineRule="auto"/>
       </w:pPr>
       <w:r>
-        <w:t>Allows multiple school-year versions to coexist for audit and migration.</w:t>
-      </w:r>
-    </w:p>
-    <w:p>
-      <w:pPr>
-        <w:pStyle w:val="Heading2"/>
-      </w:pPr>
-      <w:r>
-        <w:t>8.6 Learner Domain</w:t>
-      </w:r>
-    </w:p>
-    <w:p>
-      <w:pPr>
-        <w:pStyle w:val="Heading3"/>
-      </w:pPr>
-      <w:r>
-        <w:t>Learner Evidence Service</w:t>
+        <w:t>Prevents partially approved versions from becoming active.</w:t>
       </w:r>
     </w:p>
     <w:p>
@@ -3849,7 +3833,23 @@
         <w:spacing w:after="160" w:line="280" w:lineRule="auto"/>
       </w:pPr>
       <w:r>
-        <w:t>Stores append-oriented observations: attempts, answers, scores, criterion outcomes, confidence, time, hints, interventions, retries, and delayed reviews.</w:t>
+        <w:t>Allows multiple school-year versions to coexist for audit and migration.</w:t>
+      </w:r>
+    </w:p>
+    <w:p>
+      <w:pPr>
+        <w:pStyle w:val="Heading2"/>
+      </w:pPr>
+      <w:r>
+        <w:t>8.6 Learner Domain</w:t>
+      </w:r>
+    </w:p>
+    <w:p>
+      <w:pPr>
+        <w:pStyle w:val="Heading3"/>
+      </w:pPr>
+      <w:r>
+        <w:t>Learner Evidence Service</w:t>
       </w:r>
     </w:p>
     <w:p>
@@ -3861,7 +3861,7 @@
         <w:spacing w:after="160" w:line="280" w:lineRule="auto"/>
       </w:pPr>
       <w:r>
-        <w:t>Treats evidence as durable and attributable.</w:t>
+        <w:t>Stores append-oriented observations: attempts, answers, scores, criterion outcomes, confidence, time, hints, interventions, retries, and delayed reviews.</w:t>
       </w:r>
     </w:p>
     <w:p>
@@ -3873,7 +3873,7 @@
         <w:spacing w:after="160" w:line="280" w:lineRule="auto"/>
       </w:pPr>
       <w:r>
-        <w:t>Does not overwrite history when interpretations change.</w:t>
+        <w:t>Treats evidence as durable and attributable.</w:t>
       </w:r>
     </w:p>
     <w:p>
@@ -3885,15 +3885,7 @@
         <w:spacing w:after="160" w:line="280" w:lineRule="auto"/>
       </w:pPr>
       <w:r>
-        <w:t>Records skill-and-task state, support level, escalation route, Park timing, and immediate versus delayed outcomes.</w:t>
-      </w:r>
-    </w:p>
-    <w:p>
-      <w:pPr>
-        <w:pStyle w:val="Heading3"/>
-      </w:pPr>
-      <w:r>
-        <w:t>Learner Model Projector</w:t>
+        <w:t>Does not overwrite history when interpretations change.</w:t>
       </w:r>
     </w:p>
     <w:p>
@@ -3905,7 +3897,7 @@
         <w:spacing w:after="160" w:line="280" w:lineRule="auto"/>
       </w:pPr>
       <w:r>
-        <w:t>Converts evidence into rebuildable estimates by content, practice, task, question form, misconception, and prerequisite.</w:t>
+        <w:t>Records skill-and-task state, support level, escalation route, Park timing, and immediate versus delayed outcomes.</w:t>
       </w:r>
     </w:p>
     <w:p>
@@ -3917,7 +3909,15 @@
         <w:spacing w:after="160" w:line="280" w:lineRule="auto"/>
       </w:pPr>
       <w:r>
-        <w:t>Represents uncertainty, recency, assistance, and transfer distance.</w:t>
+        <w:t>Records assessable skill target, representation facet, Frame type, recommendation, learner override, and attempt evidence conditions.</w:t>
+      </w:r>
+    </w:p>
+    <w:p>
+      <w:pPr>
+        <w:pStyle w:val="Heading3"/>
+      </w:pPr>
+      <w:r>
+        <w:t>Learner Model Projector</w:t>
       </w:r>
     </w:p>
     <w:p>
@@ -3929,15 +3929,7 @@
         <w:spacing w:after="160" w:line="280" w:lineRule="auto"/>
       </w:pPr>
       <w:r>
-        <w:t>Produces current deficits and readiness estimates for recommendations.</w:t>
-      </w:r>
-    </w:p>
-    <w:p>
-      <w:pPr>
-        <w:pStyle w:val="Heading3"/>
-      </w:pPr>
-      <w:r>
-        <w:t>Metacognitive Calibration Service</w:t>
+        <w:t>Converts evidence into rebuildable estimates by content, practice, task, question form, misconception, and prerequisite.</w:t>
       </w:r>
     </w:p>
     <w:p>
@@ -3949,7 +3941,7 @@
         <w:spacing w:after="160" w:line="280" w:lineRule="auto"/>
       </w:pPr>
       <w:r>
-        <w:t>Compares confidence with correctness and independence.</w:t>
+        <w:t>Represents uncertainty, recency, assistance, and transfer distance.</w:t>
       </w:r>
     </w:p>
     <w:p>
@@ -3961,7 +3953,15 @@
         <w:spacing w:after="160" w:line="280" w:lineRule="auto"/>
       </w:pPr>
       <w:r>
-        <w:t>Detects recurring overconfidence and underconfidence.</w:t>
+        <w:t>Produces current deficits and readiness estimates for recommendations.</w:t>
+      </w:r>
+    </w:p>
+    <w:p>
+      <w:pPr>
+        <w:pStyle w:val="Heading3"/>
+      </w:pPr>
+      <w:r>
+        <w:t>Metacognitive Calibration Service</w:t>
       </w:r>
     </w:p>
     <w:p>
@@ -3973,15 +3973,7 @@
         <w:spacing w:after="160" w:line="280" w:lineRule="auto"/>
       </w:pPr>
       <w:r>
-        <w:t>Supplies student-facing calibration feedback and recommendation features.</w:t>
-      </w:r>
-    </w:p>
-    <w:p>
-      <w:pPr>
-        <w:pStyle w:val="Heading3"/>
-      </w:pPr>
-      <w:r>
-        <w:t>Recommendation State Store</w:t>
+        <w:t>Compares confidence with correctness and independence.</w:t>
       </w:r>
     </w:p>
     <w:p>
@@ -3993,7 +3985,7 @@
         <w:spacing w:after="160" w:line="280" w:lineRule="auto"/>
       </w:pPr>
       <w:r>
-        <w:t>Stores generated recommendations, explanations, eligibility reasons, acceptance, deferral, completion, and outcome.</w:t>
+        <w:t>Detects recurring overconfidence and underconfidence.</w:t>
       </w:r>
     </w:p>
     <w:p>
@@ -4005,7 +3997,7 @@
         <w:spacing w:after="160" w:line="280" w:lineRule="auto"/>
       </w:pPr>
       <w:r>
-        <w:t>Supports analysis of whether recommendations improved later performance.</w:t>
+        <w:t>Supplies student-facing calibration feedback and recommendation features.</w:t>
       </w:r>
     </w:p>
     <w:p>
@@ -4013,7 +4005,7 @@
         <w:pStyle w:val="Heading3"/>
       </w:pPr>
       <w:r>
-        <w:t>Improvement Dataset Builder</w:t>
+        <w:t>Recommendation State Store</w:t>
       </w:r>
     </w:p>
     <w:p>
@@ -4025,7 +4017,7 @@
         <w:spacing w:after="160" w:line="280" w:lineRule="auto"/>
       </w:pPr>
       <w:r>
-        <w:t>Creates governed anonymous or deidentified datasets from student responses, outcomes, and validator corrections.</w:t>
+        <w:t>Stores generated recommendations, explanations, eligibility reasons, acceptance, deferral, completion, and outcome.</w:t>
       </w:r>
     </w:p>
     <w:p>
@@ -4037,7 +4029,15 @@
         <w:spacing w:after="160" w:line="280" w:lineRule="auto"/>
       </w:pPr>
       <w:r>
-        <w:t>Excludes identity, account, payment, parent, and direct-contact fields.</w:t>
+        <w:t>Supports analysis of whether recommendations improved later performance.</w:t>
+      </w:r>
+    </w:p>
+    <w:p>
+      <w:pPr>
+        <w:pStyle w:val="Heading3"/>
+      </w:pPr>
+      <w:r>
+        <w:t>Improvement Dataset Builder</w:t>
       </w:r>
     </w:p>
     <w:p>
@@ -4049,7 +4049,7 @@
         <w:spacing w:after="160" w:line="280" w:lineRule="auto"/>
       </w:pPr>
       <w:r>
-        <w:t>Keeps source version, model version, adjudication status, skill-and-task key, intervention, and outcome provenance.</w:t>
+        <w:t>Creates governed anonymous or deidentified datasets from student responses, outcomes, and validator corrections.</w:t>
       </w:r>
     </w:p>
     <w:p>
@@ -4061,7 +4061,7 @@
         <w:spacing w:after="160" w:line="280" w:lineRule="auto"/>
       </w:pPr>
       <w:r>
-        <w:t>Supplies evaluation, grading, teaching, content, prompt, model-configuration, and routing-improvement workflows.</w:t>
+        <w:t>Excludes identity, account, payment, parent, and direct-contact fields.</w:t>
       </w:r>
     </w:p>
     <w:p>
@@ -4073,7 +4073,99 @@
         <w:spacing w:after="160" w:line="280" w:lineRule="auto"/>
       </w:pPr>
       <w:r>
+        <w:t>Keeps source version, model version, adjudication status, assessable skill target and facet, intervention, and outcome provenance.</w:t>
+      </w:r>
+    </w:p>
+    <w:p>
+      <w:pPr>
+        <w:numPr>
+          <w:ilvl w:val="0"/>
+          <w:numId w:val="10"/>
+        </w:numPr>
+        <w:spacing w:after="160" w:line="280" w:lineRule="auto"/>
+      </w:pPr>
+      <w:r>
+        <w:t>Supplies evaluation, grading, teaching, content, prompt, model-configuration, and routing-improvement workflows.</w:t>
+      </w:r>
+    </w:p>
+    <w:p>
+      <w:pPr>
+        <w:numPr>
+          <w:ilvl w:val="0"/>
+          <w:numId w:val="10"/>
+        </w:numPr>
+        <w:spacing w:after="160" w:line="280" w:lineRule="auto"/>
+      </w:pPr>
+      <w:r>
         <w:t>Does not publish learner material; public publication is a separate release workflow.</w:t>
+      </w:r>
+    </w:p>
+    <w:p>
+      <w:pPr>
+        <w:pStyle w:val="Heading3"/>
+      </w:pPr>
+      <w:r>
+        <w:t>Public Educational Content Publisher</w:t>
+      </w:r>
+    </w:p>
+    <w:p>
+      <w:pPr>
+        <w:numPr>
+          <w:ilvl w:val="0"/>
+          <w:numId w:val="10"/>
+        </w:numPr>
+        <w:spacing w:after="160" w:line="280" w:lineRule="auto"/>
+      </w:pPr>
+      <w:r>
+        <w:t>Is owned primarily by the marketing/content domain.</w:t>
+      </w:r>
+    </w:p>
+    <w:p>
+      <w:pPr>
+        <w:numPr>
+          <w:ilvl w:val="0"/>
+          <w:numId w:val="10"/>
+        </w:numPr>
+        <w:spacing w:after="160" w:line="280" w:lineRule="auto"/>
+      </w:pPr>
+      <w:r>
+        <w:t>Accepts only candidates that pass source, rights, identity, scientific, teaching, and grading gates.</w:t>
+      </w:r>
+    </w:p>
+    <w:p>
+      <w:pPr>
+        <w:numPr>
+          <w:ilvl w:val="0"/>
+          <w:numId w:val="10"/>
+        </w:numPr>
+        <w:spacing w:after="160" w:line="280" w:lineRule="auto"/>
+      </w:pPr>
+      <w:r>
+        <w:t>Packages approved questions, explanations, and optional transfer activities for SEO, AEO, social, and lifecycle distribution.</w:t>
+      </w:r>
+    </w:p>
+    <w:p>
+      <w:pPr>
+        <w:numPr>
+          <w:ilvl w:val="0"/>
+          <w:numId w:val="10"/>
+        </w:numPr>
+        <w:spacing w:after="160" w:line="280" w:lineRule="auto"/>
+      </w:pPr>
+      <w:r>
+        <w:t>Measures acquisition and engagement without feeding publication status into the originating learner's grade or proficiency model.</w:t>
+      </w:r>
+    </w:p>
+    <w:p>
+      <w:pPr>
+        <w:numPr>
+          <w:ilvl w:val="0"/>
+          <w:numId w:val="10"/>
+        </w:numPr>
+        <w:spacing w:after="160" w:line="280" w:lineRule="auto"/>
+      </w:pPr>
+      <w:r>
+        <w:t>Preserves version and validator provenance for every educational claim displayed publicly.</w:t>
       </w:r>
     </w:p>
     <w:p>
@@ -4831,7 +4923,9 @@
               <w:br/>
               <w:t xml:space="preserve">  -&gt; create anonymous improvement evidence under policy</w:t>
               <w:br/>
-              <w:t xml:space="preserve">  -&gt; publish only through a separate quality, rights, and identity gate</w:t>
+              <w:t xml:space="preserve">  -&gt; hand candidate to marketing/content workflow</w:t>
+              <w:br/>
+              <w:t xml:space="preserve">  -&gt; publish only through separate quality, rights, identity, and pedagogical gates</w:t>
             </w:r>
           </w:p>
         </w:tc>
@@ -7738,7 +7832,7 @@
         <w:color w:val="5A636C"/>
         <w:sz w:val="17"/>
       </w:rPr>
-      <w:t>CRAMAPPLE | SYSTEM CONTEXT AND COMPONENT ARCHITECTURE</w:t>
+      <w:t>CRAMAPPLE | SYSTEM CONTEXT AND LOGICAL COMPONENT ARCHITECTURE</w:t>
     </w:r>
   </w:p>
 </w:hdr>

</xml_diff>